<commit_message>
The Word report now describes the Streamlit chat app, links the GitHub repository and includes the new screenshots.
</commit_message>
<xml_diff>
--- a/report/African_Medical_QA_Assistant_Report.docx
+++ b/report/African_Medical_QA_Assistant_Report.docx
@@ -63,9 +63,8 @@
       <w:r>
         <w:rPr>
           <w:rFonts w:ascii="Times New Roman" w:cs="Times New Roman" w:eastAsia="Times New Roman" w:hAnsi="Times New Roman"/>
-          <w:highlight w:val="yellow"/>
-        </w:rPr>
-        <w:t xml:space="preserve">to be added</w:t>
+        </w:rPr>
+        <w:t xml:space="preserve">https://github.com/Adossi-design/African-Medical-Question-Answering-Assistant</w:t>
       </w:r>
     </w:p>
     <w:p>
@@ -105,7 +104,7 @@
           <w:rFonts w:ascii="Times New Roman" w:cs="Times New Roman" w:eastAsia="Times New Roman" w:hAnsi="Times New Roman"/>
           <w:highlight w:val="yellow"/>
         </w:rPr>
-        <w:t xml:space="preserve">to be added once the Hugging Face Space has been published and tested</w:t>
+        <w:t xml:space="preserve">to be added once the Streamlit Community Cloud app has been published and tested</w:t>
       </w:r>
     </w:p>
     <w:p>
@@ -4334,7 +4333,7 @@
           <w:i w:val="false"/>
           <w:iCs w:val="false"/>
         </w:rPr>
-        <w:t xml:space="preserve">I implemented the project in Python with PyTorch [24], Hugging Face Transformers [25], Sentence-Transformers [11], scikit-learn [26] and Gradio [27], and all experiments ran on a laptop CPU. The existing resources I used were the AfriMed-QA dataset, the pretrained multi-qa-MiniLM-L6-cos-v1 model, the SQuAD 2.0 questions and these libraries. My own work consisted of the data analysis and cleaning decisions, the leakage-free split, the evaluation setup and question sets, the fine-tuning loop and experiments, the confidence thresholds, the error analysis and the web application. Five notebooks carry out these steps in order, and the functions they share are kept in a small src folder.</w:t>
+        <w:t xml:space="preserve">I implemented the project in Python with PyTorch [24], Hugging Face Transformers [25], Sentence-Transformers [11], scikit-learn [26] and Streamlit [27], and all experiments ran on a laptop CPU. The existing resources I used were the AfriMed-QA dataset, the pretrained multi-qa-MiniLM-L6-cos-v1 model, the SQuAD 2.0 questions and these libraries. My own work consisted of the data analysis and cleaning decisions, the leakage-free split, the evaluation setup and question sets, the fine-tuning loop and experiments, the confidence thresholds, the error analysis and the web application. Five notebooks carry out these steps in order, and the functions they share are kept in a small src folder.</w:t>
       </w:r>
     </w:p>
     <w:p>
@@ -10336,7 +10335,7 @@
           <w:i w:val="false"/>
           <w:iCs w:val="false"/>
         </w:rPr>
-        <w:t xml:space="preserve">I packaged the final model together with its thresholds and the knowledge base in a single folder. The web application uses Gradio [27] and presents a title, a short explanation, a text box, an Ask button, the answer and a disclaimer stating that the system provides educational information and does not replace professional medical advice, diagnosis or treatment. When a user submits a question, the application calls the assistant module, which cleans the question, embeds it with the fine-tuned model, compares it with the answer embeddings computed when the application starts, and applies the same decision function that was used during evaluation. It then shows the answer together with the matched dataset question, the similarity score and the source of the record, or one of the two refusal messages. Answers that describe traditional remedies receive an additional caution, because such answers report contributors' practices rather than clinical guidance, and no external AI service is used at any point.</w:t>
+        <w:t xml:space="preserve">I packaged the final model, its thresholds and the knowledge base in a single folder and published the folder in a Hugging Face model repository, from which the web application downloads it when it starts. The application is a chat interface built with Streamlit [27], in which the user's questions appear on the right and the assistant's replies on the left. Each question is passed to the assistant module, which cleans it, embeds it with the fine-tuned model, compares it with the answer embeddings computed when the application starts, and applies the same decision function that was used during evaluation. The reply is either the human-written answer from the dataset or one of the two refusal messages, and answers that describe traditional remedies receive an additional caution, because such answers report contributors' practices rather than clinical guidance. The sidebar offers a button that starts a new chat, four example questions, a short description of the assistant and a disclaimer stating that the system provides educational information and does not replace professional medical advice, diagnosis or treatment. No external AI service is used at any point.</w:t>
       </w:r>
     </w:p>
     <w:p>
@@ -10350,7 +10349,21 @@
           <w:i w:val="false"/>
           <w:iCs w:val="false"/>
         </w:rPr>
-        <w:t xml:space="preserve">Figure 13 shows the application answering a question about the treatment of malaria, and Figures 14 and 15 show the two refusal messages. I took these screenshots from the application running locally on my laptop.</w:t>
+        <w:t xml:space="preserve">The similarity score, the matched dataset question and the source of each record are useful for evaluation, but they would distract ordinary users, so the interface hides them. They remain available through a debug setting in the application code, which displays them under every reply during development. The message box also accepts attached files, as many chat interfaces do, but the assistant only reads typed questions and tells the user so when a file is attached.</w:t>
+      </w:r>
+    </w:p>
+    <w:p>
+      <w:pPr>
+        <w:spacing w:after="140" w:line="288"/>
+        <w:jc w:val="both"/>
+      </w:pPr>
+      <w:r>
+        <w:rPr>
+          <w:rFonts w:ascii="Times New Roman" w:cs="Times New Roman" w:eastAsia="Times New Roman" w:hAnsi="Times New Roman"/>
+          <w:i w:val="false"/>
+          <w:iCs w:val="false"/>
+        </w:rPr>
+        <w:t xml:space="preserve">Figure 13 shows the application answering a question about the treatment of malaria, and Figures 14 and 15 show the two refusal messages. I took these screenshots from the application running on my laptop.</w:t>
       </w:r>
     </w:p>
     <w:p>
@@ -10362,7 +10375,7 @@
       <w:r>
         <w:drawing>
           <wp:inline distT="0" distB="0" distL="0" distR="0">
-            <wp:extent cx="4476750" cy="3124200"/>
+            <wp:extent cx="5715000" cy="3524250"/>
             <wp:effectExtent t="0" r="0" b="0" l="0"/>
             <wp:docPr id="13" name="" descr="" title=""/>
             <wp:cNvGraphicFramePr>
@@ -10387,7 +10400,7 @@
                   <pic:spPr bwMode="auto">
                     <a:xfrm>
                       <a:off x="0" y="0"/>
-                      <a:ext cx="4476750" cy="3124200"/>
+                      <a:ext cx="5715000" cy="3524250"/>
                     </a:xfrm>
                     <a:prstGeom prst="rect">
                       <a:avLst/>
@@ -10423,7 +10436,7 @@
           <w:sz w:val="20"/>
           <w:szCs w:val="20"/>
         </w:rPr>
-        <w:t xml:space="preserve">The web application answering "How is uncomplicated malaria treated in Africa?" with the matched dataset record, its similarity score and its source.</w:t>
+        <w:t xml:space="preserve">The chat interface answering "How is uncomplicated malaria treated in Africa?" with the human-written answer from the knowledge base.</w:t>
       </w:r>
     </w:p>
     <w:p>
@@ -10435,7 +10448,7 @@
       <w:r>
         <w:drawing>
           <wp:inline distT="0" distB="0" distL="0" distR="0">
-            <wp:extent cx="4476750" cy="2381250"/>
+            <wp:extent cx="5715000" cy="3524250"/>
             <wp:effectExtent t="0" r="0" b="0" l="0"/>
             <wp:docPr id="14" name="" descr="" title=""/>
             <wp:cNvGraphicFramePr>
@@ -10460,7 +10473,7 @@
                   <pic:spPr bwMode="auto">
                     <a:xfrm>
                       <a:off x="0" y="0"/>
-                      <a:ext cx="4476750" cy="2381250"/>
+                      <a:ext cx="5715000" cy="3524250"/>
                     </a:xfrm>
                     <a:prstGeom prst="rect">
                       <a:avLst/>
@@ -10496,7 +10509,7 @@
           <w:sz w:val="20"/>
           <w:szCs w:val="20"/>
         </w:rPr>
-        <w:t xml:space="preserve">The application refusing "How do I repair my laptop?" as outside its scope.</w:t>
+        <w:t xml:space="preserve">The assistant refusing "How do I repair my laptop?" as outside its scope.</w:t>
       </w:r>
     </w:p>
     <w:p>
@@ -10508,7 +10521,7 @@
       <w:r>
         <w:drawing>
           <wp:inline distT="0" distB="0" distL="0" distR="0">
-            <wp:extent cx="4476750" cy="2381250"/>
+            <wp:extent cx="5715000" cy="3524250"/>
             <wp:effectExtent t="0" r="0" b="0" l="0"/>
             <wp:docPr id="15" name="" descr="" title=""/>
             <wp:cNvGraphicFramePr>
@@ -10533,7 +10546,7 @@
                   <pic:spPr bwMode="auto">
                     <a:xfrm>
                       <a:off x="0" y="0"/>
-                      <a:ext cx="4476750" cy="2381250"/>
+                      <a:ext cx="5715000" cy="3524250"/>
                     </a:xfrm>
                     <a:prstGeom prst="rect">
                       <a:avLst/>
@@ -10569,7 +10582,7 @@
           <w:sz w:val="20"/>
           <w:szCs w:val="20"/>
         </w:rPr>
-        <w:t xml:space="preserve">The application answering "Is vertigo a brain problem?" with the message that it does not have enough reliable information.</w:t>
+        <w:t xml:space="preserve">The assistant replying to "Is vertigo a brain problem?" that it does not have enough reliable information.</w:t>
       </w:r>
     </w:p>
     <w:p>
@@ -10583,7 +10596,7 @@
           <w:i w:val="false"/>
           <w:iCs w:val="false"/>
         </w:rPr>
-        <w:t xml:space="preserve">At the time of writing, the application runs locally and the files needed to publish it on Hugging Face Spaces are prepared. The public link will be added at the top of this report once the application has been published and tested.</w:t>
+        <w:t xml:space="preserve">The application is prepared for Streamlit Community Cloud, which installs the libraries listed in the repository and runs the application directly from GitHub, and on Linux the requirements install the CPU-only build of PyTorch to keep the installation small. The public link will be added at the top of this report once the application has been published and tested.</w:t>
       </w:r>
     </w:p>
     <w:p>
@@ -11874,27 +11887,7 @@
           <w:sz w:val="22"/>
           <w:szCs w:val="22"/>
         </w:rPr>
-        <w:t xml:space="preserve">A. Abid, A. Abdalla, A. Abid, D. Khan, A. Alfozan, and J. Zou, "Gradio: Hassle-free sharing and testing of ML models in the wild," 2019, </w:t>
-      </w:r>
-      <w:r>
-        <w:rPr>
-          <w:rFonts w:ascii="Times New Roman" w:cs="Times New Roman" w:eastAsia="Times New Roman" w:hAnsi="Times New Roman"/>
-          <w:i/>
-          <w:iCs/>
-          <w:sz w:val="22"/>
-          <w:szCs w:val="22"/>
-        </w:rPr>
-        <w:t xml:space="preserve">arXiv:1906.02569</w:t>
-      </w:r>
-      <w:r>
-        <w:rPr>
-          <w:rFonts w:ascii="Times New Roman" w:cs="Times New Roman" w:eastAsia="Times New Roman" w:hAnsi="Times New Roman"/>
-          <w:i w:val="false"/>
-          <w:iCs w:val="false"/>
-          <w:sz w:val="22"/>
-          <w:szCs w:val="22"/>
-        </w:rPr>
-        <w:t xml:space="preserve">. [Online]. Available: https://arxiv.org/abs/1906.02569</w:t>
+        <w:t xml:space="preserve">Streamlit, "Streamlit documentation." [Online]. Available: https://docs.streamlit.io (accessed Sep. 30, 2026).</w:t>
       </w:r>
     </w:p>
     <w:p>

</xml_diff>

<commit_message>
The Word report now gives the tested live link of the app on Streamlit Community Cloud.
</commit_message>
<xml_diff>
--- a/report/African_Medical_QA_Assistant_Report.docx
+++ b/report/African_Medical_QA_Assistant_Report.docx
@@ -102,9 +102,8 @@
       <w:r>
         <w:rPr>
           <w:rFonts w:ascii="Times New Roman" w:cs="Times New Roman" w:eastAsia="Times New Roman" w:hAnsi="Times New Roman"/>
-          <w:highlight w:val="yellow"/>
-        </w:rPr>
-        <w:t xml:space="preserve">to be added once the Streamlit Community Cloud app has been published and tested</w:t>
+        </w:rPr>
+        <w:t xml:space="preserve">https://african-medical-assistant.streamlit.app</w:t>
       </w:r>
     </w:p>
     <w:p>
@@ -10596,7 +10595,7 @@
           <w:i w:val="false"/>
           <w:iCs w:val="false"/>
         </w:rPr>
-        <w:t xml:space="preserve">The application is prepared for Streamlit Community Cloud, which installs the libraries listed in the repository and runs the application directly from GitHub, and on Linux the requirements install the CPU-only build of PyTorch to keep the installation small. The public link will be added at the top of this report once the application has been published and tested.</w:t>
+        <w:t xml:space="preserve">The application is hosted on Streamlit Community Cloud at https://african-medical-assistant.streamlit.app, which installs the libraries listed in the repository and runs the application directly from GitHub. On Linux, the requirements install the CPU-only build of PyTorch to keep the installation small. I tested the hosted application at desktop and phone screen sizes with the example questions shown above, and it answered and refused them in the same way as the local version.</w:t>
       </w:r>
     </w:p>
     <w:p>

</xml_diff>

<commit_message>
The Word report explains why English was chosen and how the hosted application is woken after it has gone to sleep.
</commit_message>
<xml_diff>
--- a/report/African_Medical_QA_Assistant_Report.docx
+++ b/report/African_Medical_QA_Assistant_Report.docx
@@ -196,6 +196,20 @@
           <w:iCs w:val="false"/>
         </w:rPr>
         <w:t xml:space="preserve">In this project I use AfriMed-QA to build an English question answering assistant for educational medical information. Instead of generating new text, the assistant retrieves the human-written answer whose meaning is closest to the user's question, so every answer it gives comes from the dataset. It also has to recognise paraphrased questions rather than only exact wording, and it has to refuse questions that are unrelated to medicine or about topics that the dataset does not cover. The intended users are students, health workers and members of the public who are looking for educational information, and the system is not meant to diagnose patients or prescribe treatment.</w:t>
+      </w:r>
+    </w:p>
+    <w:p>
+      <w:pPr>
+        <w:spacing w:after="140" w:line="288"/>
+        <w:jc w:val="both"/>
+      </w:pPr>
+      <w:r>
+        <w:rPr>
+          <w:rFonts w:ascii="Times New Roman" w:cs="Times New Roman" w:eastAsia="Times New Roman" w:hAnsi="Times New Roman"/>
+          <w:i w:val="false"/>
+          <w:iCs w:val="false"/>
+        </w:rPr>
+        <w:t xml:space="preserve">I chose English because AfriMed-QA is an English dataset [5], and the Short Answer Questions that I use were written in English by contributors in Nigeria, Kenya and Malawi, so English is the one language in which the records from all three countries can be used together. An assistant in an African language would have required translating the questions and answers, and I could not have verified that translated medical answers remained correct, whereas working in English keeps every answer in its author's own words. English also allowed me to start from the pretrained English sentence-embedding model described in Section 5.3.</w:t>
       </w:r>
     </w:p>
     <w:p>
@@ -10595,7 +10609,7 @@
           <w:i w:val="false"/>
           <w:iCs w:val="false"/>
         </w:rPr>
-        <w:t xml:space="preserve">The application is hosted on Streamlit Community Cloud at https://african-medical-assistant.streamlit.app, which installs the libraries listed in the repository and runs the application directly from GitHub. On Linux, the requirements install the CPU-only build of PyTorch to keep the installation small. I tested the hosted application at desktop and phone screen sizes with the example questions shown above, and it answered and refused them in the same way as the local version.</w:t>
+        <w:t xml:space="preserve">The application is hosted on Streamlit Community Cloud at https://african-medical-assistant.streamlit.app, which installs the libraries listed in the repository and runs the application directly from GitHub. On Linux, the requirements install the CPU-only build of PyTorch to keep the installation small. I tested the hosted application at desktop and phone screen sizes with the example questions shown above, and it answered and refused them in the same way as the local version. Streamlit Community Cloud puts an application to sleep after 12 hours without visitors [27], so the page may first show a notice that the app has gone to sleep, and clicking the button "Yes, get this app back up!" on that page restarts it, which took about two minutes when I tried it. If the hosted application cannot be reached, the same application can be started on a computer by following the instructions in the README of the repository.</w:t>
       </w:r>
     </w:p>
     <w:p>

</xml_diff>